<commit_message>
linux core notes and assignment
</commit_message>
<xml_diff>
--- a/code/Buddies.docx
+++ b/code/Buddies.docx
@@ -189,38 +189,38 @@
                 <w:sz w:val="20"/>
                 <w:szCs w:val="20"/>
               </w:rPr>
-              <w:t xml:space="preserve">Vrushabh Kailas Dhomse</w:t>
-            </w:r>
-          </w:p>
-        </w:tc>
-        <w:tc>
-          <w:tcPr>
-            <w:tcW w:type="dxa" w:w="4230"/>
-            <w:tcBorders>
-              <w:top w:val="single" w:color="000000" w:sz="4"/>
-              <w:left w:val="single" w:color="000000" w:sz="4"/>
-              <w:bottom w:val="single" w:color="000000" w:sz="4"/>
-              <w:right w:val="single" w:color="000000" w:sz="4"/>
-            </w:tcBorders>
-            <w:tcMar>
-              <w:top w:type="dxa" w:w="100"/>
-              <w:left w:type="dxa" w:w="100"/>
-              <w:bottom w:type="dxa" w:w="100"/>
-              <w:right w:type="dxa" w:w="100"/>
-            </w:tcMar>
-          </w:tcPr>
-          <w:p>
-            <w:pPr>
-              <w:jc w:val="center"/>
-            </w:pPr>
-            <w:r>
-              <w:rPr>
-                <w:b w:val="false"/>
-                <w:bCs w:val="false"/>
-                <w:sz w:val="20"/>
-                <w:szCs w:val="20"/>
-              </w:rPr>
-              <w:t xml:space="preserve">Janhvi Ravindra Bhandarkar</w:t>
+              <w:t xml:space="preserve">Ruth Anand Bonala</w:t>
+            </w:r>
+          </w:p>
+        </w:tc>
+        <w:tc>
+          <w:tcPr>
+            <w:tcW w:type="dxa" w:w="4230"/>
+            <w:tcBorders>
+              <w:top w:val="single" w:color="000000" w:sz="4"/>
+              <w:left w:val="single" w:color="000000" w:sz="4"/>
+              <w:bottom w:val="single" w:color="000000" w:sz="4"/>
+              <w:right w:val="single" w:color="000000" w:sz="4"/>
+            </w:tcBorders>
+            <w:tcMar>
+              <w:top w:type="dxa" w:w="100"/>
+              <w:left w:type="dxa" w:w="100"/>
+              <w:bottom w:type="dxa" w:w="100"/>
+              <w:right w:type="dxa" w:w="100"/>
+            </w:tcMar>
+          </w:tcPr>
+          <w:p>
+            <w:pPr>
+              <w:jc w:val="center"/>
+            </w:pPr>
+            <w:r>
+              <w:rPr>
+                <w:b w:val="false"/>
+                <w:bCs w:val="false"/>
+                <w:sz w:val="20"/>
+                <w:szCs w:val="20"/>
+              </w:rPr>
+              <w:t xml:space="preserve">P. S. PRIYADARSHINI</w:t>
             </w:r>
           </w:p>
         </w:tc>
@@ -284,38 +284,38 @@
                 <w:sz w:val="20"/>
                 <w:szCs w:val="20"/>
               </w:rPr>
-              <w:t xml:space="preserve">Gracy Mitesh Shah</w:t>
-            </w:r>
-          </w:p>
-        </w:tc>
-        <w:tc>
-          <w:tcPr>
-            <w:tcW w:type="dxa" w:w="4230"/>
-            <w:tcBorders>
-              <w:top w:val="single" w:color="000000" w:sz="4"/>
-              <w:left w:val="single" w:color="000000" w:sz="4"/>
-              <w:bottom w:val="single" w:color="000000" w:sz="4"/>
-              <w:right w:val="single" w:color="000000" w:sz="4"/>
-            </w:tcBorders>
-            <w:tcMar>
-              <w:top w:type="dxa" w:w="100"/>
-              <w:left w:type="dxa" w:w="100"/>
-              <w:bottom w:type="dxa" w:w="100"/>
-              <w:right w:type="dxa" w:w="100"/>
-            </w:tcMar>
-          </w:tcPr>
-          <w:p>
-            <w:pPr>
-              <w:jc w:val="center"/>
-            </w:pPr>
-            <w:r>
-              <w:rPr>
-                <w:b w:val="false"/>
-                <w:bCs w:val="false"/>
-                <w:sz w:val="20"/>
-                <w:szCs w:val="20"/>
-              </w:rPr>
-              <w:t xml:space="preserve">Kruti Milind Bagwe</w:t>
+              <w:t xml:space="preserve">Vanshika Rajkumar Raheja</w:t>
+            </w:r>
+          </w:p>
+        </w:tc>
+        <w:tc>
+          <w:tcPr>
+            <w:tcW w:type="dxa" w:w="4230"/>
+            <w:tcBorders>
+              <w:top w:val="single" w:color="000000" w:sz="4"/>
+              <w:left w:val="single" w:color="000000" w:sz="4"/>
+              <w:bottom w:val="single" w:color="000000" w:sz="4"/>
+              <w:right w:val="single" w:color="000000" w:sz="4"/>
+            </w:tcBorders>
+            <w:tcMar>
+              <w:top w:type="dxa" w:w="100"/>
+              <w:left w:type="dxa" w:w="100"/>
+              <w:bottom w:type="dxa" w:w="100"/>
+              <w:right w:type="dxa" w:w="100"/>
+            </w:tcMar>
+          </w:tcPr>
+          <w:p>
+            <w:pPr>
+              <w:jc w:val="center"/>
+            </w:pPr>
+            <w:r>
+              <w:rPr>
+                <w:b w:val="false"/>
+                <w:bCs w:val="false"/>
+                <w:sz w:val="20"/>
+                <w:szCs w:val="20"/>
+              </w:rPr>
+              <w:t xml:space="preserve">Sanskruti Subhash Kadam</w:t>
             </w:r>
           </w:p>
         </w:tc>
@@ -379,38 +379,38 @@
                 <w:sz w:val="20"/>
                 <w:szCs w:val="20"/>
               </w:rPr>
-              <w:t xml:space="preserve">P. S. PRIYADARSHINI</w:t>
-            </w:r>
-          </w:p>
-        </w:tc>
-        <w:tc>
-          <w:tcPr>
-            <w:tcW w:type="dxa" w:w="4230"/>
-            <w:tcBorders>
-              <w:top w:val="single" w:color="000000" w:sz="4"/>
-              <w:left w:val="single" w:color="000000" w:sz="4"/>
-              <w:bottom w:val="single" w:color="000000" w:sz="4"/>
-              <w:right w:val="single" w:color="000000" w:sz="4"/>
-            </w:tcBorders>
-            <w:tcMar>
-              <w:top w:type="dxa" w:w="100"/>
-              <w:left w:type="dxa" w:w="100"/>
-              <w:bottom w:type="dxa" w:w="100"/>
-              <w:right w:type="dxa" w:w="100"/>
-            </w:tcMar>
-          </w:tcPr>
-          <w:p>
-            <w:pPr>
-              <w:jc w:val="center"/>
-            </w:pPr>
-            <w:r>
-              <w:rPr>
-                <w:b w:val="false"/>
-                <w:bCs w:val="false"/>
-                <w:sz w:val="20"/>
-                <w:szCs w:val="20"/>
-              </w:rPr>
-              <w:t xml:space="preserve">Ruth Anand Bonala</w:t>
+              <w:t xml:space="preserve">Riyaz Ismail Memon</w:t>
+            </w:r>
+          </w:p>
+        </w:tc>
+        <w:tc>
+          <w:tcPr>
+            <w:tcW w:type="dxa" w:w="4230"/>
+            <w:tcBorders>
+              <w:top w:val="single" w:color="000000" w:sz="4"/>
+              <w:left w:val="single" w:color="000000" w:sz="4"/>
+              <w:bottom w:val="single" w:color="000000" w:sz="4"/>
+              <w:right w:val="single" w:color="000000" w:sz="4"/>
+            </w:tcBorders>
+            <w:tcMar>
+              <w:top w:type="dxa" w:w="100"/>
+              <w:left w:type="dxa" w:w="100"/>
+              <w:bottom w:type="dxa" w:w="100"/>
+              <w:right w:type="dxa" w:w="100"/>
+            </w:tcMar>
+          </w:tcPr>
+          <w:p>
+            <w:pPr>
+              <w:jc w:val="center"/>
+            </w:pPr>
+            <w:r>
+              <w:rPr>
+                <w:b w:val="false"/>
+                <w:bCs w:val="false"/>
+                <w:sz w:val="20"/>
+                <w:szCs w:val="20"/>
+              </w:rPr>
+              <w:t xml:space="preserve">Aditya Nagesh Raorane</w:t>
             </w:r>
           </w:p>
         </w:tc>
@@ -474,7 +474,7 @@
                 <w:sz w:val="20"/>
                 <w:szCs w:val="20"/>
               </w:rPr>
-              <w:t xml:space="preserve">Atharva Atul Kawtikwar</w:t>
+              <w:t xml:space="preserve">Janhvi Ravindra Bhandarkar</w:t>
             </w:r>
           </w:p>
         </w:tc>
@@ -569,38 +569,38 @@
                 <w:sz w:val="20"/>
                 <w:szCs w:val="20"/>
               </w:rPr>
-              <w:t xml:space="preserve">Ruchit Ramesh Shetty</w:t>
-            </w:r>
-          </w:p>
-        </w:tc>
-        <w:tc>
-          <w:tcPr>
-            <w:tcW w:type="dxa" w:w="4230"/>
-            <w:tcBorders>
-              <w:top w:val="single" w:color="000000" w:sz="4"/>
-              <w:left w:val="single" w:color="000000" w:sz="4"/>
-              <w:bottom w:val="single" w:color="000000" w:sz="4"/>
-              <w:right w:val="single" w:color="000000" w:sz="4"/>
-            </w:tcBorders>
-            <w:tcMar>
-              <w:top w:type="dxa" w:w="100"/>
-              <w:left w:type="dxa" w:w="100"/>
-              <w:bottom w:type="dxa" w:w="100"/>
-              <w:right w:type="dxa" w:w="100"/>
-            </w:tcMar>
-          </w:tcPr>
-          <w:p>
-            <w:pPr>
-              <w:jc w:val="center"/>
-            </w:pPr>
-            <w:r>
-              <w:rPr>
-                <w:b w:val="false"/>
-                <w:bCs w:val="false"/>
-                <w:sz w:val="20"/>
-                <w:szCs w:val="20"/>
-              </w:rPr>
-              <w:t xml:space="preserve">Riddhi Nilesh Patil</w:t>
+              <w:t xml:space="preserve">Priyanka Haridas Belkhede</w:t>
+            </w:r>
+          </w:p>
+        </w:tc>
+        <w:tc>
+          <w:tcPr>
+            <w:tcW w:type="dxa" w:w="4230"/>
+            <w:tcBorders>
+              <w:top w:val="single" w:color="000000" w:sz="4"/>
+              <w:left w:val="single" w:color="000000" w:sz="4"/>
+              <w:bottom w:val="single" w:color="000000" w:sz="4"/>
+              <w:right w:val="single" w:color="000000" w:sz="4"/>
+            </w:tcBorders>
+            <w:tcMar>
+              <w:top w:type="dxa" w:w="100"/>
+              <w:left w:type="dxa" w:w="100"/>
+              <w:bottom w:type="dxa" w:w="100"/>
+              <w:right w:type="dxa" w:w="100"/>
+            </w:tcMar>
+          </w:tcPr>
+          <w:p>
+            <w:pPr>
+              <w:jc w:val="center"/>
+            </w:pPr>
+            <w:r>
+              <w:rPr>
+                <w:b w:val="false"/>
+                <w:bCs w:val="false"/>
+                <w:sz w:val="20"/>
+                <w:szCs w:val="20"/>
+              </w:rPr>
+              <w:t xml:space="preserve">Vaishnavi Mahesh Koyande</w:t>
             </w:r>
           </w:p>
         </w:tc>
@@ -664,38 +664,38 @@
                 <w:sz w:val="20"/>
                 <w:szCs w:val="20"/>
               </w:rPr>
-              <w:t xml:space="preserve">Luvv Sandesh Swami</w:t>
-            </w:r>
-          </w:p>
-        </w:tc>
-        <w:tc>
-          <w:tcPr>
-            <w:tcW w:type="dxa" w:w="4230"/>
-            <w:tcBorders>
-              <w:top w:val="single" w:color="000000" w:sz="4"/>
-              <w:left w:val="single" w:color="000000" w:sz="4"/>
-              <w:bottom w:val="single" w:color="000000" w:sz="4"/>
-              <w:right w:val="single" w:color="000000" w:sz="4"/>
-            </w:tcBorders>
-            <w:tcMar>
-              <w:top w:type="dxa" w:w="100"/>
-              <w:left w:type="dxa" w:w="100"/>
-              <w:bottom w:type="dxa" w:w="100"/>
-              <w:right w:type="dxa" w:w="100"/>
-            </w:tcMar>
-          </w:tcPr>
-          <w:p>
-            <w:pPr>
-              <w:jc w:val="center"/>
-            </w:pPr>
-            <w:r>
-              <w:rPr>
-                <w:b w:val="false"/>
-                <w:bCs w:val="false"/>
-                <w:sz w:val="20"/>
-                <w:szCs w:val="20"/>
-              </w:rPr>
-              <w:t xml:space="preserve">Nishant Sachin Khetal</w:t>
+              <w:t xml:space="preserve">Gracy Mitesh Shah</w:t>
+            </w:r>
+          </w:p>
+        </w:tc>
+        <w:tc>
+          <w:tcPr>
+            <w:tcW w:type="dxa" w:w="4230"/>
+            <w:tcBorders>
+              <w:top w:val="single" w:color="000000" w:sz="4"/>
+              <w:left w:val="single" w:color="000000" w:sz="4"/>
+              <w:bottom w:val="single" w:color="000000" w:sz="4"/>
+              <w:right w:val="single" w:color="000000" w:sz="4"/>
+            </w:tcBorders>
+            <w:tcMar>
+              <w:top w:type="dxa" w:w="100"/>
+              <w:left w:type="dxa" w:w="100"/>
+              <w:bottom w:type="dxa" w:w="100"/>
+              <w:right w:type="dxa" w:w="100"/>
+            </w:tcMar>
+          </w:tcPr>
+          <w:p>
+            <w:pPr>
+              <w:jc w:val="center"/>
+            </w:pPr>
+            <w:r>
+              <w:rPr>
+                <w:b w:val="false"/>
+                <w:bCs w:val="false"/>
+                <w:sz w:val="20"/>
+                <w:szCs w:val="20"/>
+              </w:rPr>
+              <w:t xml:space="preserve">Kaustubh Kiran Gaikwad</w:t>
             </w:r>
           </w:p>
         </w:tc>
@@ -759,38 +759,38 @@
                 <w:sz w:val="20"/>
                 <w:szCs w:val="20"/>
               </w:rPr>
-              <w:t xml:space="preserve">Vaishnavi Mahesh Koyande</w:t>
-            </w:r>
-          </w:p>
-        </w:tc>
-        <w:tc>
-          <w:tcPr>
-            <w:tcW w:type="dxa" w:w="4230"/>
-            <w:tcBorders>
-              <w:top w:val="single" w:color="000000" w:sz="4"/>
-              <w:left w:val="single" w:color="000000" w:sz="4"/>
-              <w:bottom w:val="single" w:color="000000" w:sz="4"/>
-              <w:right w:val="single" w:color="000000" w:sz="4"/>
-            </w:tcBorders>
-            <w:tcMar>
-              <w:top w:type="dxa" w:w="100"/>
-              <w:left w:type="dxa" w:w="100"/>
-              <w:bottom w:type="dxa" w:w="100"/>
-              <w:right w:type="dxa" w:w="100"/>
-            </w:tcMar>
-          </w:tcPr>
-          <w:p>
-            <w:pPr>
-              <w:jc w:val="center"/>
-            </w:pPr>
-            <w:r>
-              <w:rPr>
-                <w:b w:val="false"/>
-                <w:bCs w:val="false"/>
-                <w:sz w:val="20"/>
-                <w:szCs w:val="20"/>
-              </w:rPr>
-              <w:t xml:space="preserve">Piyush Rajesh Parate</w:t>
+              <w:t xml:space="preserve">Nishant Sachin Khetal</w:t>
+            </w:r>
+          </w:p>
+        </w:tc>
+        <w:tc>
+          <w:tcPr>
+            <w:tcW w:type="dxa" w:w="4230"/>
+            <w:tcBorders>
+              <w:top w:val="single" w:color="000000" w:sz="4"/>
+              <w:left w:val="single" w:color="000000" w:sz="4"/>
+              <w:bottom w:val="single" w:color="000000" w:sz="4"/>
+              <w:right w:val="single" w:color="000000" w:sz="4"/>
+            </w:tcBorders>
+            <w:tcMar>
+              <w:top w:type="dxa" w:w="100"/>
+              <w:left w:type="dxa" w:w="100"/>
+              <w:bottom w:type="dxa" w:w="100"/>
+              <w:right w:type="dxa" w:w="100"/>
+            </w:tcMar>
+          </w:tcPr>
+          <w:p>
+            <w:pPr>
+              <w:jc w:val="center"/>
+            </w:pPr>
+            <w:r>
+              <w:rPr>
+                <w:b w:val="false"/>
+                <w:bCs w:val="false"/>
+                <w:sz w:val="20"/>
+                <w:szCs w:val="20"/>
+              </w:rPr>
+              <w:t xml:space="preserve">Jitesh Dhanraj Kotian</w:t>
             </w:r>
           </w:p>
         </w:tc>
@@ -854,38 +854,38 @@
                 <w:sz w:val="20"/>
                 <w:szCs w:val="20"/>
               </w:rPr>
-              <w:t xml:space="preserve">Diksha Manoj Patil</w:t>
-            </w:r>
-          </w:p>
-        </w:tc>
-        <w:tc>
-          <w:tcPr>
-            <w:tcW w:type="dxa" w:w="4230"/>
-            <w:tcBorders>
-              <w:top w:val="single" w:color="000000" w:sz="4"/>
-              <w:left w:val="single" w:color="000000" w:sz="4"/>
-              <w:bottom w:val="single" w:color="000000" w:sz="4"/>
-              <w:right w:val="single" w:color="000000" w:sz="4"/>
-            </w:tcBorders>
-            <w:tcMar>
-              <w:top w:type="dxa" w:w="100"/>
-              <w:left w:type="dxa" w:w="100"/>
-              <w:bottom w:type="dxa" w:w="100"/>
-              <w:right w:type="dxa" w:w="100"/>
-            </w:tcMar>
-          </w:tcPr>
-          <w:p>
-            <w:pPr>
-              <w:jc w:val="center"/>
-            </w:pPr>
-            <w:r>
-              <w:rPr>
-                <w:b w:val="false"/>
-                <w:bCs w:val="false"/>
-                <w:sz w:val="20"/>
-                <w:szCs w:val="20"/>
-              </w:rPr>
-              <w:t xml:space="preserve">Adarsh Arvind Gupta</w:t>
+              <w:t xml:space="preserve">Riddhi Nilesh Patil</w:t>
+            </w:r>
+          </w:p>
+        </w:tc>
+        <w:tc>
+          <w:tcPr>
+            <w:tcW w:type="dxa" w:w="4230"/>
+            <w:tcBorders>
+              <w:top w:val="single" w:color="000000" w:sz="4"/>
+              <w:left w:val="single" w:color="000000" w:sz="4"/>
+              <w:bottom w:val="single" w:color="000000" w:sz="4"/>
+              <w:right w:val="single" w:color="000000" w:sz="4"/>
+            </w:tcBorders>
+            <w:tcMar>
+              <w:top w:type="dxa" w:w="100"/>
+              <w:left w:type="dxa" w:w="100"/>
+              <w:bottom w:type="dxa" w:w="100"/>
+              <w:right w:type="dxa" w:w="100"/>
+            </w:tcMar>
+          </w:tcPr>
+          <w:p>
+            <w:pPr>
+              <w:jc w:val="center"/>
+            </w:pPr>
+            <w:r>
+              <w:rPr>
+                <w:b w:val="false"/>
+                <w:bCs w:val="false"/>
+                <w:sz w:val="20"/>
+                <w:szCs w:val="20"/>
+              </w:rPr>
+              <w:t xml:space="preserve">Dhruvi Pradeepkumar Patel</w:t>
             </w:r>
           </w:p>
         </w:tc>
@@ -949,38 +949,38 @@
                 <w:sz w:val="20"/>
                 <w:szCs w:val="20"/>
               </w:rPr>
-              <w:t xml:space="preserve">Priyanka Haridas Belkhede</w:t>
-            </w:r>
-          </w:p>
-        </w:tc>
-        <w:tc>
-          <w:tcPr>
-            <w:tcW w:type="dxa" w:w="4230"/>
-            <w:tcBorders>
-              <w:top w:val="single" w:color="000000" w:sz="4"/>
-              <w:left w:val="single" w:color="000000" w:sz="4"/>
-              <w:bottom w:val="single" w:color="000000" w:sz="4"/>
-              <w:right w:val="single" w:color="000000" w:sz="4"/>
-            </w:tcBorders>
-            <w:tcMar>
-              <w:top w:type="dxa" w:w="100"/>
-              <w:left w:type="dxa" w:w="100"/>
-              <w:bottom w:type="dxa" w:w="100"/>
-              <w:right w:type="dxa" w:w="100"/>
-            </w:tcMar>
-          </w:tcPr>
-          <w:p>
-            <w:pPr>
-              <w:jc w:val="center"/>
-            </w:pPr>
-            <w:r>
-              <w:rPr>
-                <w:b w:val="false"/>
-                <w:bCs w:val="false"/>
-                <w:sz w:val="20"/>
-                <w:szCs w:val="20"/>
-              </w:rPr>
-              <w:t xml:space="preserve">Juan Allwin Andrades</w:t>
+              <w:t xml:space="preserve">Hemant Vitthalrao Jatal</w:t>
+            </w:r>
+          </w:p>
+        </w:tc>
+        <w:tc>
+          <w:tcPr>
+            <w:tcW w:type="dxa" w:w="4230"/>
+            <w:tcBorders>
+              <w:top w:val="single" w:color="000000" w:sz="4"/>
+              <w:left w:val="single" w:color="000000" w:sz="4"/>
+              <w:bottom w:val="single" w:color="000000" w:sz="4"/>
+              <w:right w:val="single" w:color="000000" w:sz="4"/>
+            </w:tcBorders>
+            <w:tcMar>
+              <w:top w:type="dxa" w:w="100"/>
+              <w:left w:type="dxa" w:w="100"/>
+              <w:bottom w:type="dxa" w:w="100"/>
+              <w:right w:type="dxa" w:w="100"/>
+            </w:tcMar>
+          </w:tcPr>
+          <w:p>
+            <w:pPr>
+              <w:jc w:val="center"/>
+            </w:pPr>
+            <w:r>
+              <w:rPr>
+                <w:b w:val="false"/>
+                <w:bCs w:val="false"/>
+                <w:sz w:val="20"/>
+                <w:szCs w:val="20"/>
+              </w:rPr>
+              <w:t xml:space="preserve">Diksha Manoj Patil</w:t>
             </w:r>
           </w:p>
         </w:tc>
@@ -1044,38 +1044,38 @@
                 <w:sz w:val="20"/>
                 <w:szCs w:val="20"/>
               </w:rPr>
-              <w:t xml:space="preserve">Dhruvi Pradeepkumar Patel</w:t>
-            </w:r>
-          </w:p>
-        </w:tc>
-        <w:tc>
-          <w:tcPr>
-            <w:tcW w:type="dxa" w:w="4230"/>
-            <w:tcBorders>
-              <w:top w:val="single" w:color="000000" w:sz="4"/>
-              <w:left w:val="single" w:color="000000" w:sz="4"/>
-              <w:bottom w:val="single" w:color="000000" w:sz="4"/>
-              <w:right w:val="single" w:color="000000" w:sz="4"/>
-            </w:tcBorders>
-            <w:tcMar>
-              <w:top w:type="dxa" w:w="100"/>
-              <w:left w:type="dxa" w:w="100"/>
-              <w:bottom w:type="dxa" w:w="100"/>
-              <w:right w:type="dxa" w:w="100"/>
-            </w:tcMar>
-          </w:tcPr>
-          <w:p>
-            <w:pPr>
-              <w:jc w:val="center"/>
-            </w:pPr>
-            <w:r>
-              <w:rPr>
-                <w:b w:val="false"/>
-                <w:bCs w:val="false"/>
-                <w:sz w:val="20"/>
-                <w:szCs w:val="20"/>
-              </w:rPr>
-              <w:t xml:space="preserve">Vanshika Rajkumar Raheja</w:t>
+              <w:t xml:space="preserve">Luvv Sandesh Swami</w:t>
+            </w:r>
+          </w:p>
+        </w:tc>
+        <w:tc>
+          <w:tcPr>
+            <w:tcW w:type="dxa" w:w="4230"/>
+            <w:tcBorders>
+              <w:top w:val="single" w:color="000000" w:sz="4"/>
+              <w:left w:val="single" w:color="000000" w:sz="4"/>
+              <w:bottom w:val="single" w:color="000000" w:sz="4"/>
+              <w:right w:val="single" w:color="000000" w:sz="4"/>
+            </w:tcBorders>
+            <w:tcMar>
+              <w:top w:type="dxa" w:w="100"/>
+              <w:left w:type="dxa" w:w="100"/>
+              <w:bottom w:type="dxa" w:w="100"/>
+              <w:right w:type="dxa" w:w="100"/>
+            </w:tcMar>
+          </w:tcPr>
+          <w:p>
+            <w:pPr>
+              <w:jc w:val="center"/>
+            </w:pPr>
+            <w:r>
+              <w:rPr>
+                <w:b w:val="false"/>
+                <w:bCs w:val="false"/>
+                <w:sz w:val="20"/>
+                <w:szCs w:val="20"/>
+              </w:rPr>
+              <w:t xml:space="preserve">Atharva Atul Kawtikwar</w:t>
             </w:r>
           </w:p>
         </w:tc>
@@ -1139,38 +1139,38 @@
                 <w:sz w:val="20"/>
                 <w:szCs w:val="20"/>
               </w:rPr>
+              <w:t xml:space="preserve">Shreeya Mahesh Bhalerao</w:t>
+            </w:r>
+          </w:p>
+        </w:tc>
+        <w:tc>
+          <w:tcPr>
+            <w:tcW w:type="dxa" w:w="4230"/>
+            <w:tcBorders>
+              <w:top w:val="single" w:color="000000" w:sz="4"/>
+              <w:left w:val="single" w:color="000000" w:sz="4"/>
+              <w:bottom w:val="single" w:color="000000" w:sz="4"/>
+              <w:right w:val="single" w:color="000000" w:sz="4"/>
+            </w:tcBorders>
+            <w:tcMar>
+              <w:top w:type="dxa" w:w="100"/>
+              <w:left w:type="dxa" w:w="100"/>
+              <w:bottom w:type="dxa" w:w="100"/>
+              <w:right w:type="dxa" w:w="100"/>
+            </w:tcMar>
+          </w:tcPr>
+          <w:p>
+            <w:pPr>
+              <w:jc w:val="center"/>
+            </w:pPr>
+            <w:r>
+              <w:rPr>
+                <w:b w:val="false"/>
+                <w:bCs w:val="false"/>
+                <w:sz w:val="20"/>
+                <w:szCs w:val="20"/>
+              </w:rPr>
               <w:t xml:space="preserve">Dhanashree Sanjay Chila</w:t>
-            </w:r>
-          </w:p>
-        </w:tc>
-        <w:tc>
-          <w:tcPr>
-            <w:tcW w:type="dxa" w:w="4230"/>
-            <w:tcBorders>
-              <w:top w:val="single" w:color="000000" w:sz="4"/>
-              <w:left w:val="single" w:color="000000" w:sz="4"/>
-              <w:bottom w:val="single" w:color="000000" w:sz="4"/>
-              <w:right w:val="single" w:color="000000" w:sz="4"/>
-            </w:tcBorders>
-            <w:tcMar>
-              <w:top w:type="dxa" w:w="100"/>
-              <w:left w:type="dxa" w:w="100"/>
-              <w:bottom w:type="dxa" w:w="100"/>
-              <w:right w:type="dxa" w:w="100"/>
-            </w:tcMar>
-          </w:tcPr>
-          <w:p>
-            <w:pPr>
-              <w:jc w:val="center"/>
-            </w:pPr>
-            <w:r>
-              <w:rPr>
-                <w:b w:val="false"/>
-                <w:bCs w:val="false"/>
-                <w:sz w:val="20"/>
-                <w:szCs w:val="20"/>
-              </w:rPr>
-              <w:t xml:space="preserve">Jai Rajesh Jain</w:t>
             </w:r>
           </w:p>
         </w:tc>
@@ -1234,38 +1234,38 @@
                 <w:sz w:val="20"/>
                 <w:szCs w:val="20"/>
               </w:rPr>
-              <w:t xml:space="preserve">Jitesh Dhanraj Kotian</w:t>
-            </w:r>
-          </w:p>
-        </w:tc>
-        <w:tc>
-          <w:tcPr>
-            <w:tcW w:type="dxa" w:w="4230"/>
-            <w:tcBorders>
-              <w:top w:val="single" w:color="000000" w:sz="4"/>
-              <w:left w:val="single" w:color="000000" w:sz="4"/>
-              <w:bottom w:val="single" w:color="000000" w:sz="4"/>
-              <w:right w:val="single" w:color="000000" w:sz="4"/>
-            </w:tcBorders>
-            <w:tcMar>
-              <w:top w:type="dxa" w:w="100"/>
-              <w:left w:type="dxa" w:w="100"/>
-              <w:bottom w:type="dxa" w:w="100"/>
-              <w:right w:type="dxa" w:w="100"/>
-            </w:tcMar>
-          </w:tcPr>
-          <w:p>
-            <w:pPr>
-              <w:jc w:val="center"/>
-            </w:pPr>
-            <w:r>
-              <w:rPr>
-                <w:b w:val="false"/>
-                <w:bCs w:val="false"/>
-                <w:sz w:val="20"/>
-                <w:szCs w:val="20"/>
-              </w:rPr>
-              <w:t xml:space="preserve">Rohan Patil</w:t>
+              <w:t xml:space="preserve">Anish Ravi Nadar</w:t>
+            </w:r>
+          </w:p>
+        </w:tc>
+        <w:tc>
+          <w:tcPr>
+            <w:tcW w:type="dxa" w:w="4230"/>
+            <w:tcBorders>
+              <w:top w:val="single" w:color="000000" w:sz="4"/>
+              <w:left w:val="single" w:color="000000" w:sz="4"/>
+              <w:bottom w:val="single" w:color="000000" w:sz="4"/>
+              <w:right w:val="single" w:color="000000" w:sz="4"/>
+            </w:tcBorders>
+            <w:tcMar>
+              <w:top w:type="dxa" w:w="100"/>
+              <w:left w:type="dxa" w:w="100"/>
+              <w:bottom w:type="dxa" w:w="100"/>
+              <w:right w:type="dxa" w:w="100"/>
+            </w:tcMar>
+          </w:tcPr>
+          <w:p>
+            <w:pPr>
+              <w:jc w:val="center"/>
+            </w:pPr>
+            <w:r>
+              <w:rPr>
+                <w:b w:val="false"/>
+                <w:bCs w:val="false"/>
+                <w:sz w:val="20"/>
+                <w:szCs w:val="20"/>
+              </w:rPr>
+              <w:t xml:space="preserve">Juan Allwin Andrades</w:t>
             </w:r>
           </w:p>
         </w:tc>
@@ -1329,38 +1329,38 @@
                 <w:sz w:val="20"/>
                 <w:szCs w:val="20"/>
               </w:rPr>
-              <w:t xml:space="preserve">Riyaz Ismail Memon</w:t>
-            </w:r>
-          </w:p>
-        </w:tc>
-        <w:tc>
-          <w:tcPr>
-            <w:tcW w:type="dxa" w:w="4230"/>
-            <w:tcBorders>
-              <w:top w:val="single" w:color="000000" w:sz="4"/>
-              <w:left w:val="single" w:color="000000" w:sz="4"/>
-              <w:bottom w:val="single" w:color="000000" w:sz="4"/>
-              <w:right w:val="single" w:color="000000" w:sz="4"/>
-            </w:tcBorders>
-            <w:tcMar>
-              <w:top w:type="dxa" w:w="100"/>
-              <w:left w:type="dxa" w:w="100"/>
-              <w:bottom w:type="dxa" w:w="100"/>
-              <w:right w:type="dxa" w:w="100"/>
-            </w:tcMar>
-          </w:tcPr>
-          <w:p>
-            <w:pPr>
-              <w:jc w:val="center"/>
-            </w:pPr>
-            <w:r>
-              <w:rPr>
-                <w:b w:val="false"/>
-                <w:bCs w:val="false"/>
-                <w:sz w:val="20"/>
-                <w:szCs w:val="20"/>
-              </w:rPr>
-              <w:t xml:space="preserve">Shreeya Mahesh Bhalerao</w:t>
+              <w:t xml:space="preserve">Rohan Patil</w:t>
+            </w:r>
+          </w:p>
+        </w:tc>
+        <w:tc>
+          <w:tcPr>
+            <w:tcW w:type="dxa" w:w="4230"/>
+            <w:tcBorders>
+              <w:top w:val="single" w:color="000000" w:sz="4"/>
+              <w:left w:val="single" w:color="000000" w:sz="4"/>
+              <w:bottom w:val="single" w:color="000000" w:sz="4"/>
+              <w:right w:val="single" w:color="000000" w:sz="4"/>
+            </w:tcBorders>
+            <w:tcMar>
+              <w:top w:type="dxa" w:w="100"/>
+              <w:left w:type="dxa" w:w="100"/>
+              <w:bottom w:type="dxa" w:w="100"/>
+              <w:right w:type="dxa" w:w="100"/>
+            </w:tcMar>
+          </w:tcPr>
+          <w:p>
+            <w:pPr>
+              <w:jc w:val="center"/>
+            </w:pPr>
+            <w:r>
+              <w:rPr>
+                <w:b w:val="false"/>
+                <w:bCs w:val="false"/>
+                <w:sz w:val="20"/>
+                <w:szCs w:val="20"/>
+              </w:rPr>
+              <w:t xml:space="preserve">Piyush Rajesh Parate</w:t>
             </w:r>
           </w:p>
         </w:tc>
@@ -1455,7 +1455,7 @@
                 <w:sz w:val="20"/>
                 <w:szCs w:val="20"/>
               </w:rPr>
-              <w:t xml:space="preserve">Bhoomi Uttam Barbole</w:t>
+              <w:t xml:space="preserve">Ruchit Ramesh Shetty</w:t>
             </w:r>
           </w:p>
         </w:tc>
@@ -1519,38 +1519,38 @@
                 <w:sz w:val="20"/>
                 <w:szCs w:val="20"/>
               </w:rPr>
-              <w:t xml:space="preserve">Sumit Jagdish Desai</w:t>
-            </w:r>
-          </w:p>
-        </w:tc>
-        <w:tc>
-          <w:tcPr>
-            <w:tcW w:type="dxa" w:w="4230"/>
-            <w:tcBorders>
-              <w:top w:val="single" w:color="000000" w:sz="4"/>
-              <w:left w:val="single" w:color="000000" w:sz="4"/>
-              <w:bottom w:val="single" w:color="000000" w:sz="4"/>
-              <w:right w:val="single" w:color="000000" w:sz="4"/>
-            </w:tcBorders>
-            <w:tcMar>
-              <w:top w:type="dxa" w:w="100"/>
-              <w:left w:type="dxa" w:w="100"/>
-              <w:bottom w:type="dxa" w:w="100"/>
-              <w:right w:type="dxa" w:w="100"/>
-            </w:tcMar>
-          </w:tcPr>
-          <w:p>
-            <w:pPr>
-              <w:jc w:val="center"/>
-            </w:pPr>
-            <w:r>
-              <w:rPr>
-                <w:b w:val="false"/>
-                <w:bCs w:val="false"/>
-                <w:sz w:val="20"/>
-                <w:szCs w:val="20"/>
-              </w:rPr>
-              <w:t xml:space="preserve">Anish Ravi Nadar</w:t>
+              <w:t xml:space="preserve">Adarsh Arvind Gupta</w:t>
+            </w:r>
+          </w:p>
+        </w:tc>
+        <w:tc>
+          <w:tcPr>
+            <w:tcW w:type="dxa" w:w="4230"/>
+            <w:tcBorders>
+              <w:top w:val="single" w:color="000000" w:sz="4"/>
+              <w:left w:val="single" w:color="000000" w:sz="4"/>
+              <w:bottom w:val="single" w:color="000000" w:sz="4"/>
+              <w:right w:val="single" w:color="000000" w:sz="4"/>
+            </w:tcBorders>
+            <w:tcMar>
+              <w:top w:type="dxa" w:w="100"/>
+              <w:left w:type="dxa" w:w="100"/>
+              <w:bottom w:type="dxa" w:w="100"/>
+              <w:right w:type="dxa" w:w="100"/>
+            </w:tcMar>
+          </w:tcPr>
+          <w:p>
+            <w:pPr>
+              <w:jc w:val="center"/>
+            </w:pPr>
+            <w:r>
+              <w:rPr>
+                <w:b w:val="false"/>
+                <w:bCs w:val="false"/>
+                <w:sz w:val="20"/>
+                <w:szCs w:val="20"/>
+              </w:rPr>
+              <w:t xml:space="preserve">Jai Rajesh Jain</w:t>
             </w:r>
           </w:p>
         </w:tc>
@@ -1614,38 +1614,38 @@
                 <w:sz w:val="20"/>
                 <w:szCs w:val="20"/>
               </w:rPr>
-              <w:t xml:space="preserve">Sanskruti Subhash Kadam</w:t>
-            </w:r>
-          </w:p>
-        </w:tc>
-        <w:tc>
-          <w:tcPr>
-            <w:tcW w:type="dxa" w:w="4230"/>
-            <w:tcBorders>
-              <w:top w:val="single" w:color="000000" w:sz="4"/>
-              <w:left w:val="single" w:color="000000" w:sz="4"/>
-              <w:bottom w:val="single" w:color="000000" w:sz="4"/>
-              <w:right w:val="single" w:color="000000" w:sz="4"/>
-            </w:tcBorders>
-            <w:tcMar>
-              <w:top w:type="dxa" w:w="100"/>
-              <w:left w:type="dxa" w:w="100"/>
-              <w:bottom w:type="dxa" w:w="100"/>
-              <w:right w:type="dxa" w:w="100"/>
-            </w:tcMar>
-          </w:tcPr>
-          <w:p>
-            <w:pPr>
-              <w:jc w:val="center"/>
-            </w:pPr>
-            <w:r>
-              <w:rPr>
-                <w:b w:val="false"/>
-                <w:bCs w:val="false"/>
-                <w:sz w:val="20"/>
-                <w:szCs w:val="20"/>
-              </w:rPr>
-              <w:t xml:space="preserve">Kaustubh Kiran Gaikwad</w:t>
+              <w:t xml:space="preserve">Vrushabh Kailas Dhomse</w:t>
+            </w:r>
+          </w:p>
+        </w:tc>
+        <w:tc>
+          <w:tcPr>
+            <w:tcW w:type="dxa" w:w="4230"/>
+            <w:tcBorders>
+              <w:top w:val="single" w:color="000000" w:sz="4"/>
+              <w:left w:val="single" w:color="000000" w:sz="4"/>
+              <w:bottom w:val="single" w:color="000000" w:sz="4"/>
+              <w:right w:val="single" w:color="000000" w:sz="4"/>
+            </w:tcBorders>
+            <w:tcMar>
+              <w:top w:type="dxa" w:w="100"/>
+              <w:left w:type="dxa" w:w="100"/>
+              <w:bottom w:type="dxa" w:w="100"/>
+              <w:right w:type="dxa" w:w="100"/>
+            </w:tcMar>
+          </w:tcPr>
+          <w:p>
+            <w:pPr>
+              <w:jc w:val="center"/>
+            </w:pPr>
+            <w:r>
+              <w:rPr>
+                <w:b w:val="false"/>
+                <w:bCs w:val="false"/>
+                <w:sz w:val="20"/>
+                <w:szCs w:val="20"/>
+              </w:rPr>
+              <w:t xml:space="preserve">Bhoomi Uttam Barbole</w:t>
             </w:r>
           </w:p>
         </w:tc>
@@ -1709,38 +1709,38 @@
                 <w:sz w:val="20"/>
                 <w:szCs w:val="20"/>
               </w:rPr>
-              <w:t xml:space="preserve">Hemant Vitthalrao Jatal</w:t>
-            </w:r>
-          </w:p>
-        </w:tc>
-        <w:tc>
-          <w:tcPr>
-            <w:tcW w:type="dxa" w:w="4230"/>
-            <w:tcBorders>
-              <w:top w:val="single" w:color="000000" w:sz="4"/>
-              <w:left w:val="single" w:color="000000" w:sz="4"/>
-              <w:bottom w:val="single" w:color="000000" w:sz="4"/>
-              <w:right w:val="single" w:color="000000" w:sz="4"/>
-            </w:tcBorders>
-            <w:tcMar>
-              <w:top w:type="dxa" w:w="100"/>
-              <w:left w:type="dxa" w:w="100"/>
-              <w:bottom w:type="dxa" w:w="100"/>
-              <w:right w:type="dxa" w:w="100"/>
-            </w:tcMar>
-          </w:tcPr>
-          <w:p>
-            <w:pPr>
-              <w:jc w:val="center"/>
-            </w:pPr>
-            <w:r>
-              <w:rPr>
-                <w:b w:val="false"/>
-                <w:bCs w:val="false"/>
-                <w:sz w:val="20"/>
-                <w:szCs w:val="20"/>
-              </w:rPr>
-              <w:t xml:space="preserve">Aditya Nagesh Raorane</w:t>
+              <w:t xml:space="preserve">Kruti Milind Bagwe</w:t>
+            </w:r>
+          </w:p>
+        </w:tc>
+        <w:tc>
+          <w:tcPr>
+            <w:tcW w:type="dxa" w:w="4230"/>
+            <w:tcBorders>
+              <w:top w:val="single" w:color="000000" w:sz="4"/>
+              <w:left w:val="single" w:color="000000" w:sz="4"/>
+              <w:bottom w:val="single" w:color="000000" w:sz="4"/>
+              <w:right w:val="single" w:color="000000" w:sz="4"/>
+            </w:tcBorders>
+            <w:tcMar>
+              <w:top w:type="dxa" w:w="100"/>
+              <w:left w:type="dxa" w:w="100"/>
+              <w:bottom w:type="dxa" w:w="100"/>
+              <w:right w:type="dxa" w:w="100"/>
+            </w:tcMar>
+          </w:tcPr>
+          <w:p>
+            <w:pPr>
+              <w:jc w:val="center"/>
+            </w:pPr>
+            <w:r>
+              <w:rPr>
+                <w:b w:val="false"/>
+                <w:bCs w:val="false"/>
+                <w:sz w:val="20"/>
+                <w:szCs w:val="20"/>
+              </w:rPr>
+              <w:t xml:space="preserve">Sumit Jagdish Desai</w:t>
             </w:r>
           </w:p>
         </w:tc>

</xml_diff>